<commit_message>
Epic 2 - Nazarii Nahirnyi
</commit_message>
<xml_diff>
--- a/ai_13/nazarii_nahirnyi/epic_2/epic_2_report_nazarii_nahirnyi.docx
+++ b/ai_13/nazarii_nahirnyi/epic_2/epic_2_report_nazarii_nahirnyi.docx
@@ -8,6 +8,7 @@
         <w:rPr>
           <w:sz w:val="28"/>
           <w:szCs w:val="28"/>
+          <w:lang w:val="uk-UA"/>
         </w:rPr>
       </w:pPr>
     </w:p>
@@ -9208,10 +9209,10 @@
         </w:rPr>
         <w:lastRenderedPageBreak/>
         <w:drawing>
-          <wp:inline distT="0" distB="0" distL="0" distR="0" wp14:anchorId="12302FA8" wp14:editId="5DA0EFD6">
-            <wp:extent cx="3185436" cy="5913632"/>
+          <wp:inline distT="0" distB="0" distL="0" distR="0" wp14:anchorId="7AAC4A34" wp14:editId="3EA7B004">
+            <wp:extent cx="3772227" cy="5982218"/>
             <wp:effectExtent l="0" t="0" r="0" b="0"/>
-            <wp:docPr id="1" name="Рисунок 1"/>
+            <wp:docPr id="6" name="Рисунок 6"/>
             <wp:cNvGraphicFramePr>
               <a:graphicFrameLocks xmlns:a="http://schemas.openxmlformats.org/drawingml/2006/main" noChangeAspect="1"/>
             </wp:cNvGraphicFramePr>
@@ -9231,7 +9232,7 @@
                   <pic:spPr>
                     <a:xfrm>
                       <a:off x="0" y="0"/>
-                      <a:ext cx="3185436" cy="5913632"/>
+                      <a:ext cx="3772227" cy="5982218"/>
                     </a:xfrm>
                     <a:prstGeom prst="rect">
                       <a:avLst/>
@@ -9243,6 +9244,8 @@
           </wp:inline>
         </w:drawing>
       </w:r>
+      <w:bookmarkStart w:id="0" w:name="_GoBack"/>
+      <w:bookmarkEnd w:id="0"/>
     </w:p>
     <w:p>
       <w:pPr>
@@ -10063,6 +10066,10 @@
         <w:jc w:val="center"/>
       </w:pPr>
       <w:r>
+        <w:rPr>
+          <w:noProof/>
+          <w:lang w:val="uk-UA" w:eastAsia="uk-UA"/>
+        </w:rPr>
         <w:lastRenderedPageBreak/>
         <w:drawing>
           <wp:inline distT="0" distB="0" distL="0" distR="0" wp14:anchorId="42DA2098" wp14:editId="452138AA">
@@ -15220,8 +15227,6 @@
         </w:rPr>
         <w:t>}</w:t>
       </w:r>
-      <w:bookmarkStart w:id="0" w:name="_GoBack"/>
-      <w:bookmarkEnd w:id="0"/>
     </w:p>
     <w:p>
       <w:pPr>
@@ -35343,14 +35348,27 @@
       <w:r>
         <w:t xml:space="preserve"> </w:t>
       </w:r>
-      <w:fldSimple w:instr=" SEQ Рис._ \* ARABIC ">
-        <w:r>
-          <w:rPr>
-            <w:noProof/>
-          </w:rPr>
-          <w:t>11</w:t>
-        </w:r>
-      </w:fldSimple>
+      <w:r>
+        <w:fldChar w:fldCharType="begin"/>
+      </w:r>
+      <w:r>
+        <w:instrText xml:space="preserve"> SEQ Рис._ \* ARABIC </w:instrText>
+      </w:r>
+      <w:r>
+        <w:fldChar w:fldCharType="separate"/>
+      </w:r>
+      <w:r>
+        <w:rPr>
+          <w:noProof/>
+        </w:rPr>
+        <w:t>11</w:t>
+      </w:r>
+      <w:r>
+        <w:rPr>
+          <w:noProof/>
+        </w:rPr>
+        <w:fldChar w:fldCharType="end"/>
+      </w:r>
       <w:r>
         <w:t>.</w:t>
       </w:r>
@@ -48084,7 +48102,7 @@
             <v:path o:extrusionok="f" gradientshapeok="t" o:connecttype="rect"/>
             <o:lock v:ext="edit" aspectratio="t"/>
           </v:shapetype>
-          <v:shape id="_x0000_i1025" type="#_x0000_t75" style="width:467.5pt;height:623.5pt">
+          <v:shape id="_x0000_i1025" type="#_x0000_t75" style="width:467.4pt;height:623.4pt">
             <v:imagedata r:id="rId31" o:title="photo_2026-10-08_01-46-02"/>
           </v:shape>
         </w:pict>
@@ -50131,7 +50149,7 @@
       </w:pPr>
       <w:r>
         <w:pict w14:anchorId="2AEC288A">
-          <v:shape id="_x0000_i1026" type="#_x0000_t75" style="width:467.5pt;height:350.5pt">
+          <v:shape id="_x0000_i1026" type="#_x0000_t75" style="width:467.4pt;height:350.4pt">
             <v:imagedata r:id="rId41" o:title="photo_2026-10-05_14-35-08"/>
           </v:shape>
         </w:pict>
@@ -50857,6 +50875,11 @@
         <w:docPartUnique/>
       </w:docPartObj>
     </w:sdtPr>
+    <w:sdtEndPr>
+      <w:rPr>
+        <w:rStyle w:val="af1"/>
+      </w:rPr>
+    </w:sdtEndPr>
     <w:sdtContent>
       <w:p>
         <w:pPr>
@@ -50909,6 +50932,11 @@
         <w:docPartUnique/>
       </w:docPartObj>
     </w:sdtPr>
+    <w:sdtEndPr>
+      <w:rPr>
+        <w:rStyle w:val="af1"/>
+      </w:rPr>
+    </w:sdtEndPr>
     <w:sdtContent>
       <w:p>
         <w:pPr>
@@ -50941,7 +50969,7 @@
             <w:rStyle w:val="af1"/>
             <w:noProof/>
           </w:rPr>
-          <w:t>16</w:t>
+          <w:t>10</w:t>
         </w:r>
         <w:r>
           <w:rPr>
@@ -53790,7 +53818,7 @@
 </file>
 
 <file path=customXml/itemProps1.xml><?xml version="1.0" encoding="utf-8"?>
-<ds:datastoreItem xmlns:ds="http://schemas.openxmlformats.org/officeDocument/2006/customXml" ds:itemID="{745BC353-6ABD-4673-A39F-05753F07BCD2}">
+<ds:datastoreItem xmlns:ds="http://schemas.openxmlformats.org/officeDocument/2006/customXml" ds:itemID="{2B03A13A-EF0F-46E3-8DB5-D55F5E16A9D3}">
   <ds:schemaRefs>
     <ds:schemaRef ds:uri="http://schemas.openxmlformats.org/officeDocument/2006/bibliography"/>
   </ds:schemaRefs>

</xml_diff>